<commit_message>
Sunum: slayt 3'te taşan metin düzeltildi, ceil() gösterimi
Kullanım süresi tanımı iki satıra bölündü (880px viewBox'ı taşıyordu),
tavan fonksiyonu Unicode köşeli parantez yerine ceil() olarak yazıldı
(font geri dönüşünde okunaklılık).

Co-Authored-By: Claude Opus 5 (1M context) <noreply@anthropic.com>
</commit_message>
<xml_diff>
--- a/sunum/dokumanlar/00 - Sunum Konusma Notlari.docx
+++ b/sunum/dokumanlar/00 - Sunum Konusma Notlari.docx
@@ -43,7 +43,7 @@
           <w:color w:val="5A6372"/>
           <w:sz w:val="28"/>
         </w:rPr>
-        <w:t>Sunum Konuşma Notları</w:t>
+        <w:t>Slayt slayt konuşma metni ve süre planı</w:t>
       </w:r>
     </w:p>
     <w:p>
@@ -239,7 +239,7 @@
                 <w:i w:val="0"/>
                 <w:sz w:val="20"/>
               </w:rPr>
-              <w:t>Sunum Konuşma Notları</w:t>
+              <w:t>Slayt slayt konuşma metni ve süre planı</w:t>
             </w:r>
           </w:p>
         </w:tc>

</xml_diff>